<commit_message>
fix(formatos): actualiza la carta-plantilla a la secretaria actual
Reemplaza el nombre/título de la secretaria en la plantilla descargable 'carta al presidente': Dra. Judith de Arcos -> Mtra. Anayeli de Jesús Patiño Laguna (título Mtra. conforme a su CV: Maestra en Farmacología, pasante del doctorado).

Co-Authored-By: Claude Opus 4.8 (1M context) <noreply@anthropic.com>
</commit_message>
<xml_diff>
--- a/public/formatos/carta-presidente-ejemplo.docx
+++ b/public/formatos/carta-presidente-ejemplo.docx
@@ -143,7 +143,7 @@
           <w:rFonts w:ascii="Arial" w:hAnsi="Arial" w:cs="Arial"/>
           <w:b/>
         </w:rPr>
-        <w:t>Atención: DR</w:t>
+        <w:t>Atención: MTR</w:t>
       </w:r>
       <w:r>
         <w:rPr>
@@ -164,7 +164,7 @@
           <w:rFonts w:ascii="Arial" w:hAnsi="Arial" w:cs="Arial"/>
           <w:b/>
         </w:rPr>
-        <w:t>JUDITH DE ARCOS JIMENEZ</w:t>
+        <w:t>ANAYELI DE JESÚS PATIÑO LAGUNA</w:t>
       </w:r>
     </w:p>
     <w:p>

</xml_diff>